<commit_message>
add rule for order status
</commit_message>
<xml_diff>
--- a/Database .docx
+++ b/Database .docx
@@ -534,6 +534,23 @@
         </w:rPr>
         <w:t>Nếu đơn hàng đã được thanh toán thành công và đang chờ phục vụ, sau 1 thời gian nhất định món ăn sẽ được giao đến tận bàn của người dùng bởi chủ quán, chủ quán sẽ tự cập nhật lại trạng thái của đơn hàng là “completed” (Tóm lại là đơn hàng chỉ có thể được đặt khi balance tại thời điểm nhấn nút gọi đồ đủ tiền, đơn hàng chỉ có 2 trạng thái là pending và completed).</w:t>
       </w:r>
+      <w:r>
+        <w:rPr>
+          <w:sz w:val="24"/>
+          <w:szCs w:val="24"/>
+          <w:lang w:val="en-US"/>
+        </w:rPr>
+        <w:t xml:space="preserve"> </w:t>
+      </w:r>
+      <w:r>
+        <w:rPr>
+          <w:color w:val="EE0000"/>
+          <w:sz w:val="24"/>
+          <w:szCs w:val="24"/>
+          <w:lang w:val="en-US"/>
+        </w:rPr>
+        <w:t>Một đơn hàng được coi là completed nếu tất cả các món trong đơn hàng đấy đều đã được đưa đến cho người dùng</w:t>
+      </w:r>
     </w:p>
     <w:p>
       <w:pPr>
@@ -910,6 +927,7 @@
           <w:sz w:val="24"/>
           <w:szCs w:val="24"/>
         </w:rPr>
+        <w:lastRenderedPageBreak/>
         <w:t>- Quản lý menu: danh sách những đồ ăn, thức uống và giá tiền của chúng,</w:t>
       </w:r>
     </w:p>
@@ -926,7 +944,6 @@
           <w:sz w:val="24"/>
           <w:szCs w:val="24"/>
         </w:rPr>
-        <w:lastRenderedPageBreak/>
         <w:t>- Quản lý số lượng đồ ăn, nước uống còn lại,</w:t>
       </w:r>
     </w:p>

</xml_diff>

<commit_message>
sửa thêm trường hợp khách hàng hủy món trong 1 order
</commit_message>
<xml_diff>
--- a/Database .docx
+++ b/Database .docx
@@ -521,6 +521,7 @@
       <w:pPr>
         <w:jc w:val="both"/>
         <w:rPr>
+          <w:color w:val="EE0000"/>
           <w:sz w:val="24"/>
           <w:szCs w:val="24"/>
           <w:lang w:val="en-US"/>
@@ -532,7 +533,7 @@
           <w:szCs w:val="24"/>
           <w:lang w:val="en-US"/>
         </w:rPr>
-        <w:t>Nếu đơn hàng đã được thanh toán thành công và đang chờ phục vụ, sau 1 thời gian nhất định món ăn sẽ được giao đến tận bàn của người dùng bởi chủ quán, chủ quán sẽ tự cập nhật lại trạng thái của đơn hàng là “completed” (Tóm lại là đơn hàng chỉ có thể được đặt khi balance tại thời điểm nhấn nút gọi đồ đủ tiền, đơn hàng chỉ có 2 trạng thái là pending và completed).</w:t>
+        <w:t>Nếu đơn hàng đã được thanh toán thành công và đang chờ phục vụ, sau 1 thời gian nhất định món ăn sẽ được giao đến tận bàn của người dùng bởi chủ quán, chủ quán sẽ tự cập nhật lại trạng thái của đơn hàng là “completed”</w:t>
       </w:r>
       <w:r>
         <w:rPr>
@@ -540,7 +541,7 @@
           <w:szCs w:val="24"/>
           <w:lang w:val="en-US"/>
         </w:rPr>
-        <w:t xml:space="preserve"> </w:t>
+        <w:t xml:space="preserve">. </w:t>
       </w:r>
       <w:r>
         <w:rPr>
@@ -550,6 +551,53 @@
           <w:lang w:val="en-US"/>
         </w:rPr>
         <w:t>Một đơn hàng được coi là completed nếu tất cả các món trong đơn hàng đấy đều đã được đưa đến cho người dùng</w:t>
+      </w:r>
+      <w:r>
+        <w:rPr>
+          <w:color w:val="EE0000"/>
+          <w:sz w:val="24"/>
+          <w:szCs w:val="24"/>
+          <w:lang w:val="en-US"/>
+        </w:rPr>
+        <w:t>.</w:t>
+      </w:r>
+    </w:p>
+    <w:p>
+      <w:pPr>
+        <w:jc w:val="both"/>
+        <w:rPr>
+          <w:color w:val="EE0000"/>
+          <w:sz w:val="24"/>
+          <w:szCs w:val="24"/>
+          <w:lang w:val="en-US"/>
+        </w:rPr>
+      </w:pPr>
+      <w:r>
+        <w:rPr>
+          <w:color w:val="EE0000"/>
+          <w:sz w:val="24"/>
+          <w:szCs w:val="24"/>
+          <w:lang w:val="en-US"/>
+        </w:rPr>
+        <w:t>Người dùng có thể hủy món ăn nào đó bằng cách nhắn với chủ quán, chủ quán sẽ quyết định xem có thể hủy món hay không, nếu món được hủy</w:t>
+      </w:r>
+      <w:r>
+        <w:rPr>
+          <w:color w:val="EE0000"/>
+          <w:sz w:val="24"/>
+          <w:szCs w:val="24"/>
+          <w:lang w:val="en-US"/>
+        </w:rPr>
+        <w:t xml:space="preserve"> (chủ quán sẽ tự chỉnh trạng thái của món ăn trong đơn hàng thành cancel )</w:t>
+      </w:r>
+      <w:r>
+        <w:rPr>
+          <w:color w:val="EE0000"/>
+          <w:sz w:val="24"/>
+          <w:szCs w:val="24"/>
+          <w:lang w:val="en-US"/>
+        </w:rPr>
+        <w:t xml:space="preserve"> thì tài khoản của người dùng sẽ được cộng lại tiền tương ứng, order sẽ bị hủy nếu tất cả các món đều bị hủy</w:t>
       </w:r>
     </w:p>
     <w:p>
@@ -870,6 +918,7 @@
           <w:sz w:val="24"/>
           <w:szCs w:val="24"/>
         </w:rPr>
+        <w:lastRenderedPageBreak/>
         <w:t>Thứ tư</w:t>
       </w:r>
       <w:r>
@@ -927,7 +976,6 @@
           <w:sz w:val="24"/>
           <w:szCs w:val="24"/>
         </w:rPr>
-        <w:lastRenderedPageBreak/>
         <w:t>- Quản lý menu: danh sách những đồ ăn, thức uống và giá tiền của chúng,</w:t>
       </w:r>
     </w:p>

</xml_diff>